<commit_message>
Restore interviewer signature below Faisal in BAP documents
</commit_message>
<xml_diff>
--- a/public/templates/bap-2026.docx
+++ b/public/templates/bap-2026.docx
@@ -15183,6 +15183,1028 @@
           <w:p>
             <w:pPr>
               <w:spacing w:after="100" w:line="276" w:lineRule="auto"/>
+              <w:keepNext/>
+            </w:pPr>
+            <w:r>
+              <w:rPr>
+                <w:rFonts w:ascii="Arial" w:hAnsi="Arial" w:cs="Arial" w:eastAsia="Arial"/>
+                <w:sz w:val="22"/>
+                <w:color w:val="000000"/>
+              </w:rPr>
+              <w:t xml:space="preserve"/>
+            </w:r>
+          </w:p>
+        </w:tc>
+        <w:tc>
+          <w:tcPr>
+            <w:tcW w:w="200" w:type="dxa"/>
+            <w:shd w:val="clear" w:color="auto" w:fill="FFFFFF"/>
+            <w:tcBorders>
+              <w:top w:val="nil"/>
+              <w:left w:val="nil"/>
+              <w:bottom w:val="nil"/>
+              <w:right w:val="nil"/>
+            </w:tcBorders>
+            <w:tcMar>
+              <w:top w:w="0" w:type="dxa"/>
+              <w:left w:w="0" w:type="dxa"/>
+              <w:bottom w:w="0" w:type="dxa"/>
+              <w:right w:w="0" w:type="dxa"/>
+            </w:tcMar>
+          </w:tcPr>
+          <w:p>
+            <w:pPr>
+              <w:spacing w:after="100" w:line="276" w:lineRule="auto"/>
+              <w:keepNext/>
+            </w:pPr>
+            <w:r>
+              <w:rPr>
+                <w:rFonts w:ascii="Arial" w:hAnsi="Arial" w:cs="Arial" w:eastAsia="Arial"/>
+                <w:sz w:val="22"/>
+                <w:color w:val="000000"/>
+              </w:rPr>
+              <w:t xml:space="preserve"/>
+            </w:r>
+          </w:p>
+        </w:tc>
+        <w:tc>
+          <w:tcPr>
+            <w:tcW w:w="2920" w:type="dxa"/>
+            <w:shd w:val="clear" w:color="auto" w:fill="FFFFFF"/>
+            <w:tcBorders>
+              <w:top w:val="nil"/>
+              <w:left w:val="nil"/>
+              <w:bottom w:val="nil"/>
+              <w:right w:val="nil"/>
+            </w:tcBorders>
+            <w:tcMar>
+              <w:top w:w="0" w:type="dxa"/>
+              <w:left w:w="0" w:type="dxa"/>
+              <w:bottom w:w="0" w:type="dxa"/>
+              <w:right w:w="0" w:type="dxa"/>
+            </w:tcMar>
+          </w:tcPr>
+          <w:p>
+            <w:pPr>
+              <w:spacing w:after="100" w:line="276" w:lineRule="auto"/>
+              <w:keepNext/>
+            </w:pPr>
+            <w:r>
+              <w:rPr>
+                <w:rFonts w:ascii="Arial" w:hAnsi="Arial" w:cs="Arial" w:eastAsia="Arial"/>
+                <w:sz w:val="22"/>
+                <w:color w:val="000000"/>
+              </w:rPr>
+              <w:t xml:space="preserve"/>
+            </w:r>
+          </w:p>
+        </w:tc>
+        <w:tc>
+          <w:tcPr>
+            <w:tcW w:w="450" w:type="dxa"/>
+            <w:shd w:val="clear" w:color="auto" w:fill="FFFFFF"/>
+            <w:tcBorders>
+              <w:top w:val="nil"/>
+              <w:left w:val="nil"/>
+              <w:bottom w:val="nil"/>
+              <w:right w:val="nil"/>
+            </w:tcBorders>
+            <w:tcMar>
+              <w:top w:w="0" w:type="dxa"/>
+              <w:left w:w="0" w:type="dxa"/>
+              <w:bottom w:w="0" w:type="dxa"/>
+              <w:right w:w="0" w:type="dxa"/>
+            </w:tcMar>
+          </w:tcPr>
+          <w:p>
+            <w:pPr>
+              <w:spacing w:after="100" w:line="276" w:lineRule="auto"/>
+              <w:keepNext/>
+            </w:pPr>
+            <w:r>
+              <w:rPr>
+                <w:rFonts w:ascii="Arial" w:hAnsi="Arial" w:cs="Arial" w:eastAsia="Arial"/>
+                <w:sz w:val="22"/>
+                <w:color w:val="000000"/>
+              </w:rPr>
+              <w:t xml:space="preserve"/>
+            </w:r>
+          </w:p>
+        </w:tc>
+        <w:tc>
+          <w:tcPr>
+            <w:tcW w:w="1400" w:type="dxa"/>
+            <w:shd w:val="clear" w:color="auto" w:fill="FFFFFF"/>
+            <w:tcBorders>
+              <w:top w:val="nil"/>
+              <w:left w:val="nil"/>
+              <w:bottom w:val="nil"/>
+              <w:right w:val="nil"/>
+            </w:tcBorders>
+            <w:tcMar>
+              <w:top w:w="0" w:type="dxa"/>
+              <w:left w:w="0" w:type="dxa"/>
+              <w:bottom w:w="0" w:type="dxa"/>
+              <w:right w:w="0" w:type="dxa"/>
+            </w:tcMar>
+          </w:tcPr>
+          <w:p>
+            <w:pPr>
+              <w:spacing w:after="100" w:line="276" w:lineRule="auto"/>
+              <w:keepNext/>
+            </w:pPr>
+            <w:r>
+              <w:rPr>
+                <w:rFonts w:ascii="Arial" w:hAnsi="Arial" w:cs="Arial" w:eastAsia="Arial"/>
+                <w:sz w:val="22"/>
+                <w:color w:val="000000"/>
+              </w:rPr>
+              <w:t xml:space="preserve"/>
+            </w:r>
+          </w:p>
+        </w:tc>
+        <w:tc>
+          <w:tcPr>
+            <w:tcW w:w="200" w:type="dxa"/>
+            <w:shd w:val="clear" w:color="auto" w:fill="FFFFFF"/>
+            <w:tcBorders>
+              <w:top w:val="nil"/>
+              <w:left w:val="nil"/>
+              <w:bottom w:val="nil"/>
+              <w:right w:val="nil"/>
+            </w:tcBorders>
+            <w:tcMar>
+              <w:top w:w="0" w:type="dxa"/>
+              <w:left w:w="0" w:type="dxa"/>
+              <w:bottom w:w="0" w:type="dxa"/>
+              <w:right w:w="0" w:type="dxa"/>
+            </w:tcMar>
+          </w:tcPr>
+          <w:p>
+            <w:pPr>
+              <w:spacing w:after="100" w:line="276" w:lineRule="auto"/>
+              <w:keepNext/>
+            </w:pPr>
+            <w:r>
+              <w:rPr>
+                <w:rFonts w:ascii="Arial" w:hAnsi="Arial" w:cs="Arial" w:eastAsia="Arial"/>
+                <w:sz w:val="22"/>
+                <w:color w:val="000000"/>
+              </w:rPr>
+              <w:t xml:space="preserve"/>
+            </w:r>
+          </w:p>
+        </w:tc>
+        <w:tc>
+          <w:tcPr>
+            <w:tcW w:w="3047" w:type="dxa"/>
+            <w:shd w:val="clear" w:color="auto" w:fill="FFFFFF"/>
+            <w:tcBorders>
+              <w:top w:val="nil"/>
+              <w:left w:val="nil"/>
+              <w:bottom w:val="nil"/>
+              <w:right w:val="nil"/>
+            </w:tcBorders>
+            <w:tcMar>
+              <w:top w:w="0" w:type="dxa"/>
+              <w:left w:w="0" w:type="dxa"/>
+              <w:bottom w:w="0" w:type="dxa"/>
+              <w:right w:w="0" w:type="dxa"/>
+            </w:tcMar>
+          </w:tcPr>
+          <w:p>
+            <w:pPr>
+              <w:spacing w:after="100" w:line="276" w:lineRule="auto"/>
+              <w:keepNext/>
+            </w:pPr>
+            <w:r>
+              <w:rPr>
+                <w:rFonts w:ascii="Arial" w:hAnsi="Arial" w:cs="Arial" w:eastAsia="Arial"/>
+                <w:sz w:val="22"/>
+                <w:color w:val="000000"/>
+              </w:rPr>
+              <w:t xml:space="preserve"/>
+            </w:r>
+          </w:p>
+        </w:tc>
+      </w:tr>
+      <w:tr>
+        <w:trPr>
+          <w:cantSplit/>
+        </w:trPr>
+        <w:tc>
+          <w:tcPr>
+            <w:tcW w:w="4520" w:type="dxa"/>
+            <w:shd w:val="clear" w:color="auto" w:fill="FFFFFF"/>
+            <w:tcBorders>
+              <w:top w:val="nil"/>
+              <w:left w:val="nil"/>
+              <w:bottom w:val="nil"/>
+              <w:right w:val="nil"/>
+            </w:tcBorders>
+            <w:tcMar>
+              <w:top w:w="0" w:type="dxa"/>
+              <w:left w:w="0" w:type="dxa"/>
+              <w:bottom w:w="0" w:type="dxa"/>
+              <w:right w:w="0" w:type="dxa"/>
+            </w:tcMar>
+            <w:gridSpan w:val="3"/>
+          </w:tcPr>
+          <w:p>
+            <w:pPr>
+              <w:spacing w:after="100" w:line="276" w:lineRule="auto"/>
+              <w:keepNext/>
+            </w:pPr>
+            <w:r>
+              <w:rPr>
+                <w:b/>
+                <w:rFonts w:ascii="Arial" w:hAnsi="Arial" w:cs="Arial" w:eastAsia="Arial"/>
+                <w:sz w:val="22"/>
+                <w:color w:val="000000"/>
+              </w:rPr>
+              <w:t xml:space="preserve"/>
+            </w:r>
+          </w:p>
+        </w:tc>
+        <w:tc>
+          <w:tcPr>
+            <w:tcW w:w="450" w:type="dxa"/>
+            <w:shd w:val="clear" w:color="auto" w:fill="FFFFFF"/>
+            <w:tcBorders>
+              <w:top w:val="nil"/>
+              <w:left w:val="nil"/>
+              <w:bottom w:val="nil"/>
+              <w:right w:val="nil"/>
+            </w:tcBorders>
+            <w:tcMar>
+              <w:top w:w="0" w:type="dxa"/>
+              <w:left w:w="0" w:type="dxa"/>
+              <w:bottom w:w="0" w:type="dxa"/>
+              <w:right w:w="0" w:type="dxa"/>
+            </w:tcMar>
+          </w:tcPr>
+          <w:p>
+            <w:pPr>
+              <w:spacing w:after="100" w:line="276" w:lineRule="auto"/>
+              <w:keepNext/>
+            </w:pPr>
+            <w:r>
+              <w:rPr>
+                <w:rFonts w:ascii="Arial" w:hAnsi="Arial" w:cs="Arial" w:eastAsia="Arial"/>
+                <w:sz w:val="22"/>
+                <w:color w:val="000000"/>
+              </w:rPr>
+              <w:t xml:space="preserve"/>
+            </w:r>
+          </w:p>
+        </w:tc>
+        <w:tc>
+          <w:tcPr>
+            <w:tcW w:w="4647" w:type="dxa"/>
+            <w:shd w:val="clear" w:color="auto" w:fill="FFFFFF"/>
+            <w:tcBorders>
+              <w:top w:val="nil"/>
+              <w:left w:val="nil"/>
+              <w:bottom w:val="nil"/>
+              <w:right w:val="nil"/>
+            </w:tcBorders>
+            <w:tcMar>
+              <w:top w:w="0" w:type="dxa"/>
+              <w:left w:w="0" w:type="dxa"/>
+              <w:bottom w:w="0" w:type="dxa"/>
+              <w:right w:w="0" w:type="dxa"/>
+            </w:tcMar>
+            <w:gridSpan w:val="3"/>
+          </w:tcPr>
+          <w:p>
+            <w:pPr>
+              <w:spacing w:after="100" w:line="276" w:lineRule="auto"/>
+              <w:keepNext/>
+            </w:pPr>
+            <w:r>
+              <w:rPr>
+                <w:b/>
+                <w:rFonts w:ascii="Arial" w:hAnsi="Arial" w:cs="Arial" w:eastAsia="Arial"/>
+                <w:sz w:val="22"/>
+                <w:color w:val="000000"/>
+              </w:rPr>
+              <w:t xml:space="preserve">Pewawancara:</w:t>
+            </w:r>
+          </w:p>
+        </w:tc>
+      </w:tr>
+      <w:tr>
+        <w:trPr>
+          <w:cantSplit/>
+        </w:trPr>
+        <w:tc>
+          <w:tcPr>
+            <w:tcW w:w="1400" w:type="dxa"/>
+            <w:shd w:val="clear" w:color="auto" w:fill="FFFFFF"/>
+            <w:tcBorders>
+              <w:top w:val="nil"/>
+              <w:left w:val="nil"/>
+              <w:bottom w:val="nil"/>
+              <w:right w:val="nil"/>
+            </w:tcBorders>
+            <w:tcMar>
+              <w:top w:w="0" w:type="dxa"/>
+              <w:left w:w="0" w:type="dxa"/>
+              <w:bottom w:w="0" w:type="dxa"/>
+              <w:right w:w="0" w:type="dxa"/>
+            </w:tcMar>
+          </w:tcPr>
+          <w:p>
+            <w:pPr>
+              <w:spacing w:after="100" w:line="276" w:lineRule="auto"/>
+              <w:keepNext/>
+            </w:pPr>
+            <w:r>
+              <w:rPr>
+                <w:rFonts w:ascii="Arial" w:hAnsi="Arial" w:cs="Arial" w:eastAsia="Arial"/>
+                <w:sz w:val="22"/>
+                <w:color w:val="000000"/>
+              </w:rPr>
+              <w:t xml:space="preserve"/>
+            </w:r>
+          </w:p>
+        </w:tc>
+        <w:tc>
+          <w:tcPr>
+            <w:tcW w:w="200" w:type="dxa"/>
+            <w:shd w:val="clear" w:color="auto" w:fill="FFFFFF"/>
+            <w:tcBorders>
+              <w:top w:val="nil"/>
+              <w:left w:val="nil"/>
+              <w:bottom w:val="nil"/>
+              <w:right w:val="nil"/>
+            </w:tcBorders>
+            <w:tcMar>
+              <w:top w:w="0" w:type="dxa"/>
+              <w:left w:w="0" w:type="dxa"/>
+              <w:bottom w:w="0" w:type="dxa"/>
+              <w:right w:w="0" w:type="dxa"/>
+            </w:tcMar>
+          </w:tcPr>
+          <w:p>
+            <w:pPr>
+              <w:spacing w:after="100" w:line="276" w:lineRule="auto"/>
+              <w:keepNext/>
+            </w:pPr>
+            <w:r>
+              <w:rPr>
+                <w:rFonts w:ascii="Arial" w:hAnsi="Arial" w:cs="Arial" w:eastAsia="Arial"/>
+                <w:sz w:val="22"/>
+                <w:color w:val="000000"/>
+              </w:rPr>
+              <w:t xml:space="preserve"/>
+            </w:r>
+          </w:p>
+        </w:tc>
+        <w:tc>
+          <w:tcPr>
+            <w:tcW w:w="2920" w:type="dxa"/>
+            <w:shd w:val="clear" w:color="auto" w:fill="FFFFFF"/>
+            <w:tcBorders>
+              <w:top w:val="nil"/>
+              <w:left w:val="nil"/>
+              <w:bottom w:val="nil"/>
+              <w:right w:val="nil"/>
+            </w:tcBorders>
+            <w:tcMar>
+              <w:top w:w="0" w:type="dxa"/>
+              <w:left w:w="0" w:type="dxa"/>
+              <w:bottom w:w="0" w:type="dxa"/>
+              <w:right w:w="0" w:type="dxa"/>
+            </w:tcMar>
+          </w:tcPr>
+          <w:p>
+            <w:pPr>
+              <w:spacing w:after="100" w:line="276" w:lineRule="auto"/>
+              <w:keepNext/>
+            </w:pPr>
+            <w:r>
+              <w:rPr>
+                <w:rFonts w:ascii="Arial" w:hAnsi="Arial" w:cs="Arial" w:eastAsia="Arial"/>
+                <w:sz w:val="22"/>
+                <w:color w:val="000000"/>
+              </w:rPr>
+              <w:t xml:space="preserve"/>
+            </w:r>
+          </w:p>
+        </w:tc>
+        <w:tc>
+          <w:tcPr>
+            <w:tcW w:w="450" w:type="dxa"/>
+            <w:shd w:val="clear" w:color="auto" w:fill="FFFFFF"/>
+            <w:tcBorders>
+              <w:top w:val="nil"/>
+              <w:left w:val="nil"/>
+              <w:bottom w:val="nil"/>
+              <w:right w:val="nil"/>
+            </w:tcBorders>
+            <w:tcMar>
+              <w:top w:w="0" w:type="dxa"/>
+              <w:left w:w="0" w:type="dxa"/>
+              <w:bottom w:w="0" w:type="dxa"/>
+              <w:right w:w="0" w:type="dxa"/>
+            </w:tcMar>
+          </w:tcPr>
+          <w:p>
+            <w:pPr>
+              <w:spacing w:after="100" w:line="276" w:lineRule="auto"/>
+              <w:keepNext/>
+            </w:pPr>
+            <w:r>
+              <w:rPr>
+                <w:rFonts w:ascii="Arial" w:hAnsi="Arial" w:cs="Arial" w:eastAsia="Arial"/>
+                <w:sz w:val="22"/>
+                <w:color w:val="000000"/>
+              </w:rPr>
+              <w:t xml:space="preserve"/>
+            </w:r>
+          </w:p>
+        </w:tc>
+        <w:tc>
+          <w:tcPr>
+            <w:tcW w:w="1400" w:type="dxa"/>
+            <w:shd w:val="clear" w:color="auto" w:fill="FFFFFF"/>
+            <w:tcBorders>
+              <w:top w:val="nil"/>
+              <w:left w:val="nil"/>
+              <w:bottom w:val="nil"/>
+              <w:right w:val="nil"/>
+            </w:tcBorders>
+            <w:tcMar>
+              <w:top w:w="0" w:type="dxa"/>
+              <w:left w:w="0" w:type="dxa"/>
+              <w:bottom w:w="0" w:type="dxa"/>
+              <w:right w:w="0" w:type="dxa"/>
+            </w:tcMar>
+          </w:tcPr>
+          <w:p>
+            <w:pPr>
+              <w:spacing w:after="100" w:line="276" w:lineRule="auto"/>
+              <w:keepNext/>
+            </w:pPr>
+            <w:r>
+              <w:rPr>
+                <w:rFonts w:ascii="Arial" w:hAnsi="Arial" w:cs="Arial" w:eastAsia="Arial"/>
+                <w:sz w:val="22"/>
+                <w:color w:val="000000"/>
+              </w:rPr>
+              <w:t xml:space="preserve">Nama</w:t>
+            </w:r>
+          </w:p>
+        </w:tc>
+        <w:tc>
+          <w:tcPr>
+            <w:tcW w:w="200" w:type="dxa"/>
+            <w:shd w:val="clear" w:color="auto" w:fill="FFFFFF"/>
+            <w:tcBorders>
+              <w:top w:val="nil"/>
+              <w:left w:val="nil"/>
+              <w:bottom w:val="nil"/>
+              <w:right w:val="nil"/>
+            </w:tcBorders>
+            <w:tcMar>
+              <w:top w:w="0" w:type="dxa"/>
+              <w:left w:w="0" w:type="dxa"/>
+              <w:bottom w:w="0" w:type="dxa"/>
+              <w:right w:w="0" w:type="dxa"/>
+            </w:tcMar>
+          </w:tcPr>
+          <w:p>
+            <w:pPr>
+              <w:spacing w:after="100" w:line="276" w:lineRule="auto"/>
+              <w:keepNext/>
+            </w:pPr>
+            <w:r>
+              <w:rPr>
+                <w:rFonts w:ascii="Arial" w:hAnsi="Arial" w:cs="Arial" w:eastAsia="Arial"/>
+                <w:sz w:val="22"/>
+                <w:color w:val="000000"/>
+              </w:rPr>
+              <w:t xml:space="preserve">:</w:t>
+            </w:r>
+          </w:p>
+        </w:tc>
+        <w:tc>
+          <w:tcPr>
+            <w:tcW w:w="3047" w:type="dxa"/>
+            <w:shd w:val="clear" w:color="auto" w:fill="FFFFFF"/>
+            <w:tcBorders>
+              <w:top w:val="nil"/>
+              <w:left w:val="nil"/>
+              <w:bottom w:val="nil"/>
+              <w:right w:val="nil"/>
+            </w:tcBorders>
+            <w:tcMar>
+              <w:top w:w="0" w:type="dxa"/>
+              <w:left w:w="0" w:type="dxa"/>
+              <w:bottom w:w="0" w:type="dxa"/>
+              <w:right w:w="0" w:type="dxa"/>
+            </w:tcMar>
+          </w:tcPr>
+          <w:p>
+            <w:pPr>
+              <w:spacing w:after="100" w:line="276" w:lineRule="auto"/>
+              <w:keepNext/>
+            </w:pPr>
+            <w:r>
+              <w:rPr>
+                <w:rFonts w:ascii="Arial" w:hAnsi="Arial" w:cs="Arial" w:eastAsia="Arial"/>
+                <w:sz w:val="22"/>
+                <w:color w:val="000000"/>
+              </w:rPr>
+              <w:t xml:space="preserve">{pewawancaraNama}</w:t>
+            </w:r>
+          </w:p>
+        </w:tc>
+      </w:tr>
+      <w:tr>
+        <w:trPr>
+          <w:cantSplit/>
+        </w:trPr>
+        <w:tc>
+          <w:tcPr>
+            <w:tcW w:w="1400" w:type="dxa"/>
+            <w:shd w:val="clear" w:color="auto" w:fill="FFFFFF"/>
+            <w:tcBorders>
+              <w:top w:val="nil"/>
+              <w:left w:val="nil"/>
+              <w:bottom w:val="nil"/>
+              <w:right w:val="nil"/>
+            </w:tcBorders>
+            <w:tcMar>
+              <w:top w:w="0" w:type="dxa"/>
+              <w:left w:w="0" w:type="dxa"/>
+              <w:bottom w:w="0" w:type="dxa"/>
+              <w:right w:w="0" w:type="dxa"/>
+            </w:tcMar>
+          </w:tcPr>
+          <w:p>
+            <w:pPr>
+              <w:spacing w:after="100" w:line="276" w:lineRule="auto"/>
+              <w:keepNext/>
+            </w:pPr>
+            <w:r>
+              <w:rPr>
+                <w:rFonts w:ascii="Arial" w:hAnsi="Arial" w:cs="Arial" w:eastAsia="Arial"/>
+                <w:sz w:val="22"/>
+                <w:color w:val="000000"/>
+              </w:rPr>
+              <w:t xml:space="preserve"/>
+            </w:r>
+          </w:p>
+        </w:tc>
+        <w:tc>
+          <w:tcPr>
+            <w:tcW w:w="200" w:type="dxa"/>
+            <w:shd w:val="clear" w:color="auto" w:fill="FFFFFF"/>
+            <w:tcBorders>
+              <w:top w:val="nil"/>
+              <w:left w:val="nil"/>
+              <w:bottom w:val="nil"/>
+              <w:right w:val="nil"/>
+            </w:tcBorders>
+            <w:tcMar>
+              <w:top w:w="0" w:type="dxa"/>
+              <w:left w:w="0" w:type="dxa"/>
+              <w:bottom w:w="0" w:type="dxa"/>
+              <w:right w:w="0" w:type="dxa"/>
+            </w:tcMar>
+          </w:tcPr>
+          <w:p>
+            <w:pPr>
+              <w:spacing w:after="100" w:line="276" w:lineRule="auto"/>
+              <w:keepNext/>
+            </w:pPr>
+            <w:r>
+              <w:rPr>
+                <w:rFonts w:ascii="Arial" w:hAnsi="Arial" w:cs="Arial" w:eastAsia="Arial"/>
+                <w:sz w:val="22"/>
+                <w:color w:val="000000"/>
+              </w:rPr>
+              <w:t xml:space="preserve"/>
+            </w:r>
+          </w:p>
+        </w:tc>
+        <w:tc>
+          <w:tcPr>
+            <w:tcW w:w="2920" w:type="dxa"/>
+            <w:shd w:val="clear" w:color="auto" w:fill="FFFFFF"/>
+            <w:tcBorders>
+              <w:top w:val="nil"/>
+              <w:left w:val="nil"/>
+              <w:bottom w:val="nil"/>
+              <w:right w:val="nil"/>
+            </w:tcBorders>
+            <w:tcMar>
+              <w:top w:w="0" w:type="dxa"/>
+              <w:left w:w="0" w:type="dxa"/>
+              <w:bottom w:w="0" w:type="dxa"/>
+              <w:right w:w="0" w:type="dxa"/>
+            </w:tcMar>
+          </w:tcPr>
+          <w:p>
+            <w:pPr>
+              <w:spacing w:after="100" w:line="276" w:lineRule="auto"/>
+              <w:keepNext/>
+            </w:pPr>
+            <w:r>
+              <w:rPr>
+                <w:rFonts w:ascii="Arial" w:hAnsi="Arial" w:cs="Arial" w:eastAsia="Arial"/>
+                <w:sz w:val="22"/>
+                <w:color w:val="000000"/>
+              </w:rPr>
+              <w:t xml:space="preserve"/>
+            </w:r>
+          </w:p>
+        </w:tc>
+        <w:tc>
+          <w:tcPr>
+            <w:tcW w:w="450" w:type="dxa"/>
+            <w:shd w:val="clear" w:color="auto" w:fill="FFFFFF"/>
+            <w:tcBorders>
+              <w:top w:val="nil"/>
+              <w:left w:val="nil"/>
+              <w:bottom w:val="nil"/>
+              <w:right w:val="nil"/>
+            </w:tcBorders>
+            <w:tcMar>
+              <w:top w:w="0" w:type="dxa"/>
+              <w:left w:w="0" w:type="dxa"/>
+              <w:bottom w:w="0" w:type="dxa"/>
+              <w:right w:w="0" w:type="dxa"/>
+            </w:tcMar>
+          </w:tcPr>
+          <w:p>
+            <w:pPr>
+              <w:spacing w:after="100" w:line="276" w:lineRule="auto"/>
+              <w:keepNext/>
+            </w:pPr>
+            <w:r>
+              <w:rPr>
+                <w:rFonts w:ascii="Arial" w:hAnsi="Arial" w:cs="Arial" w:eastAsia="Arial"/>
+                <w:sz w:val="22"/>
+                <w:color w:val="000000"/>
+              </w:rPr>
+              <w:t xml:space="preserve"/>
+            </w:r>
+          </w:p>
+        </w:tc>
+        <w:tc>
+          <w:tcPr>
+            <w:tcW w:w="1400" w:type="dxa"/>
+            <w:shd w:val="clear" w:color="auto" w:fill="FFFFFF"/>
+            <w:tcBorders>
+              <w:top w:val="nil"/>
+              <w:left w:val="nil"/>
+              <w:bottom w:val="nil"/>
+              <w:right w:val="nil"/>
+            </w:tcBorders>
+            <w:tcMar>
+              <w:top w:w="0" w:type="dxa"/>
+              <w:left w:w="0" w:type="dxa"/>
+              <w:bottom w:w="0" w:type="dxa"/>
+              <w:right w:w="0" w:type="dxa"/>
+            </w:tcMar>
+          </w:tcPr>
+          <w:p>
+            <w:pPr>
+              <w:spacing w:after="100" w:line="276" w:lineRule="auto"/>
+              <w:keepNext/>
+            </w:pPr>
+            <w:r>
+              <w:rPr>
+                <w:rFonts w:ascii="Arial" w:hAnsi="Arial" w:cs="Arial" w:eastAsia="Arial"/>
+                <w:sz w:val="22"/>
+                <w:color w:val="000000"/>
+              </w:rPr>
+              <w:t xml:space="preserve">NIP</w:t>
+            </w:r>
+          </w:p>
+        </w:tc>
+        <w:tc>
+          <w:tcPr>
+            <w:tcW w:w="200" w:type="dxa"/>
+            <w:shd w:val="clear" w:color="auto" w:fill="FFFFFF"/>
+            <w:tcBorders>
+              <w:top w:val="nil"/>
+              <w:left w:val="nil"/>
+              <w:bottom w:val="nil"/>
+              <w:right w:val="nil"/>
+            </w:tcBorders>
+            <w:tcMar>
+              <w:top w:w="0" w:type="dxa"/>
+              <w:left w:w="0" w:type="dxa"/>
+              <w:bottom w:w="0" w:type="dxa"/>
+              <w:right w:w="0" w:type="dxa"/>
+            </w:tcMar>
+          </w:tcPr>
+          <w:p>
+            <w:pPr>
+              <w:spacing w:after="100" w:line="276" w:lineRule="auto"/>
+              <w:keepNext/>
+            </w:pPr>
+            <w:r>
+              <w:rPr>
+                <w:rFonts w:ascii="Arial" w:hAnsi="Arial" w:cs="Arial" w:eastAsia="Arial"/>
+                <w:sz w:val="22"/>
+                <w:color w:val="000000"/>
+              </w:rPr>
+              <w:t xml:space="preserve">:</w:t>
+            </w:r>
+          </w:p>
+        </w:tc>
+        <w:tc>
+          <w:tcPr>
+            <w:tcW w:w="3047" w:type="dxa"/>
+            <w:shd w:val="clear" w:color="auto" w:fill="FFFFFF"/>
+            <w:tcBorders>
+              <w:top w:val="nil"/>
+              <w:left w:val="nil"/>
+              <w:bottom w:val="nil"/>
+              <w:right w:val="nil"/>
+            </w:tcBorders>
+            <w:tcMar>
+              <w:top w:w="0" w:type="dxa"/>
+              <w:left w:w="0" w:type="dxa"/>
+              <w:bottom w:w="0" w:type="dxa"/>
+              <w:right w:w="0" w:type="dxa"/>
+            </w:tcMar>
+          </w:tcPr>
+          <w:p>
+            <w:pPr>
+              <w:spacing w:after="100" w:line="276" w:lineRule="auto"/>
+              <w:keepNext/>
+            </w:pPr>
+            <w:r>
+              <w:rPr>
+                <w:rFonts w:ascii="Arial" w:hAnsi="Arial" w:cs="Arial" w:eastAsia="Arial"/>
+                <w:sz w:val="22"/>
+                <w:color w:val="000000"/>
+              </w:rPr>
+              <w:t xml:space="preserve">{pewawancaraNip}</w:t>
+            </w:r>
+          </w:p>
+        </w:tc>
+      </w:tr>
+      <w:tr>
+        <w:trPr>
+          <w:cantSplit/>
+        </w:trPr>
+        <w:tc>
+          <w:tcPr>
+            <w:tcW w:w="1400" w:type="dxa"/>
+            <w:shd w:val="clear" w:color="auto" w:fill="FFFFFF"/>
+            <w:tcBorders>
+              <w:top w:val="nil"/>
+              <w:left w:val="nil"/>
+              <w:bottom w:val="nil"/>
+              <w:right w:val="nil"/>
+            </w:tcBorders>
+            <w:tcMar>
+              <w:top w:w="0" w:type="dxa"/>
+              <w:left w:w="0" w:type="dxa"/>
+              <w:bottom w:w="0" w:type="dxa"/>
+              <w:right w:w="0" w:type="dxa"/>
+            </w:tcMar>
+          </w:tcPr>
+          <w:p>
+            <w:pPr>
+              <w:spacing w:after="100" w:line="276" w:lineRule="auto"/>
+              <w:keepNext/>
+            </w:pPr>
+            <w:r>
+              <w:rPr>
+                <w:rFonts w:ascii="Arial" w:hAnsi="Arial" w:cs="Arial" w:eastAsia="Arial"/>
+                <w:sz w:val="22"/>
+                <w:color w:val="000000"/>
+              </w:rPr>
+              <w:t xml:space="preserve"/>
+            </w:r>
+          </w:p>
+        </w:tc>
+        <w:tc>
+          <w:tcPr>
+            <w:tcW w:w="200" w:type="dxa"/>
+            <w:shd w:val="clear" w:color="auto" w:fill="FFFFFF"/>
+            <w:tcBorders>
+              <w:top w:val="nil"/>
+              <w:left w:val="nil"/>
+              <w:bottom w:val="nil"/>
+              <w:right w:val="nil"/>
+            </w:tcBorders>
+            <w:tcMar>
+              <w:top w:w="0" w:type="dxa"/>
+              <w:left w:w="0" w:type="dxa"/>
+              <w:bottom w:w="0" w:type="dxa"/>
+              <w:right w:w="0" w:type="dxa"/>
+            </w:tcMar>
+          </w:tcPr>
+          <w:p>
+            <w:pPr>
+              <w:spacing w:after="100" w:line="276" w:lineRule="auto"/>
+              <w:keepNext/>
+            </w:pPr>
+            <w:r>
+              <w:rPr>
+                <w:rFonts w:ascii="Arial" w:hAnsi="Arial" w:cs="Arial" w:eastAsia="Arial"/>
+                <w:sz w:val="22"/>
+                <w:color w:val="000000"/>
+              </w:rPr>
+              <w:t xml:space="preserve"/>
+            </w:r>
+          </w:p>
+        </w:tc>
+        <w:tc>
+          <w:tcPr>
+            <w:tcW w:w="2920" w:type="dxa"/>
+            <w:shd w:val="clear" w:color="auto" w:fill="FFFFFF"/>
+            <w:tcBorders>
+              <w:top w:val="nil"/>
+              <w:left w:val="nil"/>
+              <w:bottom w:val="nil"/>
+              <w:right w:val="nil"/>
+            </w:tcBorders>
+            <w:tcMar>
+              <w:top w:w="0" w:type="dxa"/>
+              <w:left w:w="0" w:type="dxa"/>
+              <w:bottom w:w="0" w:type="dxa"/>
+              <w:right w:w="0" w:type="dxa"/>
+            </w:tcMar>
+          </w:tcPr>
+          <w:p>
+            <w:pPr>
+              <w:spacing w:after="100" w:line="276" w:lineRule="auto"/>
+              <w:keepNext/>
+            </w:pPr>
+            <w:r>
+              <w:rPr>
+                <w:rFonts w:ascii="Arial" w:hAnsi="Arial" w:cs="Arial" w:eastAsia="Arial"/>
+                <w:sz w:val="22"/>
+                <w:color w:val="000000"/>
+              </w:rPr>
+              <w:t xml:space="preserve"/>
+            </w:r>
+          </w:p>
+        </w:tc>
+        <w:tc>
+          <w:tcPr>
+            <w:tcW w:w="450" w:type="dxa"/>
+            <w:shd w:val="clear" w:color="auto" w:fill="FFFFFF"/>
+            <w:tcBorders>
+              <w:top w:val="nil"/>
+              <w:left w:val="nil"/>
+              <w:bottom w:val="nil"/>
+              <w:right w:val="nil"/>
+            </w:tcBorders>
+            <w:tcMar>
+              <w:top w:w="0" w:type="dxa"/>
+              <w:left w:w="0" w:type="dxa"/>
+              <w:bottom w:w="0" w:type="dxa"/>
+              <w:right w:w="0" w:type="dxa"/>
+            </w:tcMar>
+          </w:tcPr>
+          <w:p>
+            <w:pPr>
+              <w:spacing w:after="100" w:line="276" w:lineRule="auto"/>
+              <w:keepNext/>
+            </w:pPr>
+            <w:r>
+              <w:rPr>
+                <w:rFonts w:ascii="Arial" w:hAnsi="Arial" w:cs="Arial" w:eastAsia="Arial"/>
+                <w:sz w:val="22"/>
+                <w:color w:val="000000"/>
+              </w:rPr>
+              <w:t xml:space="preserve"/>
+            </w:r>
+          </w:p>
+        </w:tc>
+        <w:tc>
+          <w:tcPr>
+            <w:tcW w:w="1400" w:type="dxa"/>
+            <w:shd w:val="clear" w:color="auto" w:fill="FFFFFF"/>
+            <w:tcBorders>
+              <w:top w:val="nil"/>
+              <w:left w:val="nil"/>
+              <w:bottom w:val="nil"/>
+              <w:right w:val="nil"/>
+            </w:tcBorders>
+            <w:tcMar>
+              <w:top w:w="0" w:type="dxa"/>
+              <w:left w:w="0" w:type="dxa"/>
+              <w:bottom w:w="0" w:type="dxa"/>
+              <w:right w:w="0" w:type="dxa"/>
+            </w:tcMar>
+          </w:tcPr>
+          <w:p>
+            <w:pPr>
+              <w:spacing w:after="100" w:line="276" w:lineRule="auto"/>
+              <w:keepNext/>
+            </w:pPr>
+            <w:r>
+              <w:rPr>
+                <w:rFonts w:ascii="Arial" w:hAnsi="Arial" w:cs="Arial" w:eastAsia="Arial"/>
+                <w:sz w:val="22"/>
+                <w:color w:val="000000"/>
+              </w:rPr>
+              <w:t xml:space="preserve">Tanda tangan</w:t>
+            </w:r>
+          </w:p>
+        </w:tc>
+        <w:tc>
+          <w:tcPr>
+            <w:tcW w:w="200" w:type="dxa"/>
+            <w:shd w:val="clear" w:color="auto" w:fill="FFFFFF"/>
+            <w:tcBorders>
+              <w:top w:val="nil"/>
+              <w:left w:val="nil"/>
+              <w:bottom w:val="nil"/>
+              <w:right w:val="nil"/>
+            </w:tcBorders>
+            <w:tcMar>
+              <w:top w:w="0" w:type="dxa"/>
+              <w:left w:w="0" w:type="dxa"/>
+              <w:bottom w:w="0" w:type="dxa"/>
+              <w:right w:w="0" w:type="dxa"/>
+            </w:tcMar>
+          </w:tcPr>
+          <w:p>
+            <w:pPr>
+              <w:spacing w:after="100" w:line="276" w:lineRule="auto"/>
+              <w:keepNext/>
+            </w:pPr>
+            <w:r>
+              <w:rPr>
+                <w:rFonts w:ascii="Arial" w:hAnsi="Arial" w:cs="Arial" w:eastAsia="Arial"/>
+                <w:sz w:val="22"/>
+                <w:color w:val="000000"/>
+              </w:rPr>
+              <w:t xml:space="preserve">:</w:t>
+            </w:r>
+          </w:p>
+        </w:tc>
+        <w:tc>
+          <w:tcPr>
+            <w:tcW w:w="3047" w:type="dxa"/>
+            <w:shd w:val="clear" w:color="auto" w:fill="FFFFFF"/>
+            <w:tcBorders>
+              <w:top w:val="nil"/>
+              <w:left w:val="nil"/>
+              <w:bottom w:val="nil"/>
+              <w:right w:val="nil"/>
+            </w:tcBorders>
+            <w:tcMar>
+              <w:top w:w="0" w:type="dxa"/>
+              <w:left w:w="0" w:type="dxa"/>
+              <w:bottom w:w="0" w:type="dxa"/>
+              <w:right w:w="0" w:type="dxa"/>
+            </w:tcMar>
+          </w:tcPr>
+          <w:p>
+            <w:pPr>
+              <w:spacing w:after="100" w:line="276" w:lineRule="auto"/>
+              <w:keepNext/>
+            </w:pPr>
+            <w:r>
+              <w:rPr>
+                <w:rFonts w:ascii="Arial" w:hAnsi="Arial" w:cs="Arial" w:eastAsia="Arial"/>
+                <w:sz w:val="22"/>
+                <w:color w:val="000000"/>
+              </w:rPr>
+              <w:t xml:space="preserve"/>
+            </w:r>
+          </w:p>
+        </w:tc>
+      </w:tr>
+      <w:tr>
+        <w:trPr>
+          <w:cantSplit/>
+          <w:trHeight w:val="800" w:hRule="atLeast"/>
+        </w:trPr>
+        <w:tc>
+          <w:tcPr>
+            <w:tcW w:w="1400" w:type="dxa"/>
+            <w:shd w:val="clear" w:color="auto" w:fill="FFFFFF"/>
+            <w:tcBorders>
+              <w:top w:val="nil"/>
+              <w:left w:val="nil"/>
+              <w:bottom w:val="nil"/>
+              <w:right w:val="nil"/>
+            </w:tcBorders>
+            <w:tcMar>
+              <w:top w:w="0" w:type="dxa"/>
+              <w:left w:w="0" w:type="dxa"/>
+              <w:bottom w:w="0" w:type="dxa"/>
+              <w:right w:w="0" w:type="dxa"/>
+            </w:tcMar>
+          </w:tcPr>
+          <w:p>
+            <w:pPr>
+              <w:spacing w:after="100" w:line="276" w:lineRule="auto"/>
             </w:pPr>
             <w:r>
               <w:rPr>
@@ -15384,30 +16406,15 @@
     </w:tbl>
     <w:p>
       <w:pPr>
-        <w:spacing w:after="0" w:line="276" w:lineRule="auto"/>
-        <w:jc w:val="both"/>
-        <w:rPr>
-          <w:rFonts w:ascii="Arial" w:eastAsia="Arial" w:hAnsi="Arial" w:cs="Arial"/>
-          <w:lang w:val="id-ID"/>
-        </w:rPr>
-      </w:pPr>
-    </w:p>
-    <w:p>
-      <w:pPr>
-        <w:spacing w:after="120" w:line="276" w:lineRule="auto"/>
-        <w:jc w:val="both"/>
-        <w:rPr>
-          <w:rFonts w:ascii="Arial" w:hAnsi="Arial" w:cs="Arial"/>
-          <w:lang w:val="id-ID"/>
-        </w:rPr>
+        <w:spacing w:after="0" w:line="20" w:lineRule="exact"/>
       </w:pPr>
       <w:r>
         <w:rPr>
+          <w:rFonts w:ascii="Arial" w:hAnsi="Arial" w:cs="Arial" w:eastAsia="Arial"/>
+          <w:sz w:val="2"/>
           <w:color w:val="000000"/>
-          <w:rFonts w:ascii="Arial" w:hAnsi="Arial" w:cs="Arial" w:eastAsia="Arial"/>
-          <w:lang w:val="id-ID"/>
         </w:rPr>
-        <w:t xml:space="preserve"> </w:t>
+        <w:t xml:space="preserve"/>
       </w:r>
     </w:p>
     <w:sectPr>

</xml_diff>

<commit_message>
Remove interviewer heading from BAP signature block
</commit_message>
<xml_diff>
--- a/public/templates/bap-2026.docx
+++ b/public/templates/bap-2026.docx
@@ -15384,111 +15384,6 @@
                 <w:color w:val="000000"/>
               </w:rPr>
               <w:t xml:space="preserve"/>
-            </w:r>
-          </w:p>
-        </w:tc>
-      </w:tr>
-      <w:tr>
-        <w:trPr>
-          <w:cantSplit/>
-        </w:trPr>
-        <w:tc>
-          <w:tcPr>
-            <w:tcW w:w="4520" w:type="dxa"/>
-            <w:shd w:val="clear" w:color="auto" w:fill="FFFFFF"/>
-            <w:tcBorders>
-              <w:top w:val="nil"/>
-              <w:left w:val="nil"/>
-              <w:bottom w:val="nil"/>
-              <w:right w:val="nil"/>
-            </w:tcBorders>
-            <w:tcMar>
-              <w:top w:w="0" w:type="dxa"/>
-              <w:left w:w="0" w:type="dxa"/>
-              <w:bottom w:w="0" w:type="dxa"/>
-              <w:right w:w="0" w:type="dxa"/>
-            </w:tcMar>
-            <w:gridSpan w:val="3"/>
-          </w:tcPr>
-          <w:p>
-            <w:pPr>
-              <w:spacing w:after="100" w:line="276" w:lineRule="auto"/>
-              <w:keepNext/>
-            </w:pPr>
-            <w:r>
-              <w:rPr>
-                <w:b/>
-                <w:rFonts w:ascii="Arial" w:hAnsi="Arial" w:cs="Arial" w:eastAsia="Arial"/>
-                <w:sz w:val="22"/>
-                <w:color w:val="000000"/>
-              </w:rPr>
-              <w:t xml:space="preserve"/>
-            </w:r>
-          </w:p>
-        </w:tc>
-        <w:tc>
-          <w:tcPr>
-            <w:tcW w:w="450" w:type="dxa"/>
-            <w:shd w:val="clear" w:color="auto" w:fill="FFFFFF"/>
-            <w:tcBorders>
-              <w:top w:val="nil"/>
-              <w:left w:val="nil"/>
-              <w:bottom w:val="nil"/>
-              <w:right w:val="nil"/>
-            </w:tcBorders>
-            <w:tcMar>
-              <w:top w:w="0" w:type="dxa"/>
-              <w:left w:w="0" w:type="dxa"/>
-              <w:bottom w:w="0" w:type="dxa"/>
-              <w:right w:w="0" w:type="dxa"/>
-            </w:tcMar>
-          </w:tcPr>
-          <w:p>
-            <w:pPr>
-              <w:spacing w:after="100" w:line="276" w:lineRule="auto"/>
-              <w:keepNext/>
-            </w:pPr>
-            <w:r>
-              <w:rPr>
-                <w:rFonts w:ascii="Arial" w:hAnsi="Arial" w:cs="Arial" w:eastAsia="Arial"/>
-                <w:sz w:val="22"/>
-                <w:color w:val="000000"/>
-              </w:rPr>
-              <w:t xml:space="preserve"/>
-            </w:r>
-          </w:p>
-        </w:tc>
-        <w:tc>
-          <w:tcPr>
-            <w:tcW w:w="4647" w:type="dxa"/>
-            <w:shd w:val="clear" w:color="auto" w:fill="FFFFFF"/>
-            <w:tcBorders>
-              <w:top w:val="nil"/>
-              <w:left w:val="nil"/>
-              <w:bottom w:val="nil"/>
-              <w:right w:val="nil"/>
-            </w:tcBorders>
-            <w:tcMar>
-              <w:top w:w="0" w:type="dxa"/>
-              <w:left w:w="0" w:type="dxa"/>
-              <w:bottom w:w="0" w:type="dxa"/>
-              <w:right w:w="0" w:type="dxa"/>
-            </w:tcMar>
-            <w:gridSpan w:val="3"/>
-          </w:tcPr>
-          <w:p>
-            <w:pPr>
-              <w:spacing w:after="100" w:line="276" w:lineRule="auto"/>
-              <w:keepNext/>
-            </w:pPr>
-            <w:r>
-              <w:rPr>
-                <w:b/>
-                <w:rFonts w:ascii="Arial" w:hAnsi="Arial" w:cs="Arial" w:eastAsia="Arial"/>
-                <w:sz w:val="22"/>
-                <w:color w:val="000000"/>
-              </w:rPr>
-              <w:t xml:space="preserve">Pewawancara:</w:t>
             </w:r>
           </w:p>
         </w:tc>

</xml_diff>